<commit_message>
Update Section 6 standalone: add 6.3 (DOA/TC/POA holdership) and expand abbreviations
- New subsection 6.3 explaining the DOA/TC/POA regulatory triad and who
  holds each in Models 1 and 2 (all at PrincipalCo; holding cannot hold them)
- Replace loose 'right to manufacture and sell' bullet with manufacturing
  licence (Aero) + POA; add POA to Model 1 holder list
- Spell out each abbreviation on first use with parenthetical short form

https://claude.ai/code/session_01JTbBsiSWXRS1fuAGFXnjiU
</commit_message>
<xml_diff>
--- a/STRIKER_Раздел_6_права_на_разработку.docx
+++ b/STRIKER_Раздел_6_права_на_разработку.docx
@@ -3,6 +3,9 @@
 <w:document xmlns:wpc="http://schemas.microsoft.com/office/word/2010/wordprocessingCanvas" xmlns:mo="http://schemas.microsoft.com/office/mac/office/2008/main" xmlns:mc="http://schemas.openxmlformats.org/markup-compatibility/2006" xmlns:mv="urn:schemas-microsoft-com:mac:vml" xmlns:o="urn:schemas-microsoft-com:office:office" xmlns:r="http://schemas.openxmlformats.org/officeDocument/2006/relationships" xmlns:m="http://schemas.openxmlformats.org/officeDocument/2006/math" xmlns:v="urn:schemas-microsoft-com:vml" xmlns:wp14="http://schemas.microsoft.com/office/word/2010/wordprocessingDrawing" xmlns:wp="http://schemas.openxmlformats.org/drawingml/2006/wordprocessingDrawing" xmlns:w10="urn:schemas-microsoft-com:office:word" xmlns:w="http://schemas.openxmlformats.org/wordprocessingml/2006/main" xmlns:w14="http://schemas.microsoft.com/office/word/2010/wordml" xmlns:wpg="http://schemas.microsoft.com/office/word/2010/wordprocessingGroup" xmlns:wpi="http://schemas.microsoft.com/office/word/2010/wordprocessingInk" xmlns:wne="http://schemas.microsoft.com/office/word/2006/wordml" xmlns:wps="http://schemas.microsoft.com/office/word/2010/wordprocessingShape" mc:Ignorable="w14 wp14">
   <w:body>
     <w:p>
+      <w:pPr>
+        <w:spacing w:before="0" w:after="120"/>
+      </w:pPr>
       <w:r>
         <w:rPr>
           <w:b/>
@@ -79,10 +82,10 @@
         <w:rPr>
           <w:b/>
         </w:rPr>
-        <w:t>Право на серийное изготовление и продажу</w:t>
+        <w:t>Лицензия на серийное производство</w:t>
       </w:r>
       <w:r>
-        <w:t xml:space="preserve"> самолётов данного типа.</w:t>
+        <w:t xml:space="preserve"> от владельца платформы (Aero Vodochody) — в пределах согласованных территории, объёма и области применения — и одобрение производственной организации (POA) как регуляторное условие серийного выпуска.</w:t>
       </w:r>
     </w:p>
     <w:p>
@@ -111,6 +114,9 @@
       </w:r>
     </w:p>
     <w:p>
+      <w:pPr>
+        <w:spacing w:before="280" w:after="120"/>
+      </w:pPr>
       <w:r>
         <w:rPr>
           <w:b/>
@@ -126,7 +132,7 @@
         <w:jc w:val="both"/>
       </w:pPr>
       <w:r>
-        <w:t>Права закрепляются за болгарской операционной компанией (PrincipalCo) — там же, где находятся статус OEM и роль держателя типовой сертификации. Прибыль облагается в Болгарии по ставке 10%, поднимается в холдинг дивидендами без удержания и распределяется инвесторам; внутригрупповых лицензионных платежей и роялти не возникает.</w:t>
+        <w:t>Права закрепляются за болгарской операционной компанией (PrincipalCo) — там же, где находятся статус OEM, роль держателя типовой сертификации и одобрение производственной организации (POA). Прибыль облагается в Болгарии по ставке 10%, поднимается в холдинг дивидендами без удержания и распределяется инвесторам; внутригрупповых лицензионных платежей и роялти не возникает.</w:t>
       </w:r>
     </w:p>
     <w:p>
@@ -194,6 +200,9 @@
       </w:r>
     </w:p>
     <w:p>
+      <w:pPr>
+        <w:spacing w:before="280" w:after="120"/>
+      </w:pPr>
       <w:r>
         <w:rPr>
           <w:b/>
@@ -281,6 +290,131 @@
       </w:r>
       <w:r>
         <w:t xml:space="preserve"> Для авиапроекта с лицензированной платформой и покупными ключевыми компонентами выигрыш Модели 2 невелик и не покрывает её сложности и рисков. Рекомендуется Модель 1; к Модели 2 имеет смысл вернуться лишь если в будущем у группы появятся собственные патентоспособные разработки, созданные её силами.</w:t>
+      </w:r>
+    </w:p>
+    <w:p>
+      <w:pPr>
+        <w:spacing w:before="280" w:after="120"/>
+      </w:pPr>
+      <w:r>
+        <w:rPr>
+          <w:b/>
+          <w:color w:val="1B2A4A"/>
+          <w:sz w:val="30"/>
+        </w:rPr>
+        <w:t>6.3 Кто держит сертификационные статусы (DOA, TC, POA)</w:t>
+      </w:r>
+    </w:p>
+    <w:p>
+      <w:pPr>
+        <w:spacing w:after="120"/>
+        <w:jc w:val="both"/>
+      </w:pPr>
+      <w:r>
+        <w:t>Три регуляторных статуса нужно отличать от владения интеллектуальной собственностью — это не «права собственности», а операционные допуски, выдаваемые авиационными властями (EASA) конкретной организации:</w:t>
+      </w:r>
+    </w:p>
+    <w:p>
+      <w:pPr>
+        <w:pStyle w:val="ListBullet"/>
+        <w:spacing w:after="80"/>
+        <w:jc w:val="both"/>
+      </w:pPr>
+      <w:r>
+        <w:rPr>
+          <w:b/>
+        </w:rPr>
+        <w:t>DOA (Part-21, Subpart J)</w:t>
+      </w:r>
+      <w:r>
+        <w:t xml:space="preserve"> — про разработку: одобрение конструкторской организации.</w:t>
+      </w:r>
+    </w:p>
+    <w:p>
+      <w:pPr>
+        <w:pStyle w:val="ListBullet"/>
+        <w:spacing w:after="80"/>
+        <w:jc w:val="both"/>
+      </w:pPr>
+      <w:r>
+        <w:rPr>
+          <w:b/>
+        </w:rPr>
+        <w:t>Сертификат типа, TC (Part-21, Subpart B)</w:t>
+      </w:r>
+      <w:r>
+        <w:t xml:space="preserve"> — про продукт: одобрение самой конструкции типа.</w:t>
+      </w:r>
+    </w:p>
+    <w:p>
+      <w:pPr>
+        <w:pStyle w:val="ListBullet"/>
+        <w:spacing w:after="80"/>
+        <w:jc w:val="both"/>
+      </w:pPr>
+      <w:r>
+        <w:rPr>
+          <w:b/>
+        </w:rPr>
+        <w:t>POA (Part-21, Subpart G)</w:t>
+      </w:r>
+      <w:r>
+        <w:t xml:space="preserve"> — про производство: одобрение завода серийно строить самолёты в соответствии с одобренной конструкцией.</w:t>
+      </w:r>
+    </w:p>
+    <w:p>
+      <w:pPr>
+        <w:spacing w:after="120"/>
+        <w:jc w:val="both"/>
+      </w:pPr>
+      <w:r>
+        <w:t>Эти статусы требуют реальной организации — КБ, производства, персонала, системы качества. Холдинг по своей природе пассивная инвестиционная компания без таких функций и присутствия, поэтому держать их не может и не должен. Поэтому в обеих моделях все три статуса закрепляются за болгарской операционной компанией (PrincipalCo):</w:t>
+      </w:r>
+    </w:p>
+    <w:p>
+      <w:pPr>
+        <w:pStyle w:val="ListBullet"/>
+        <w:spacing w:after="80"/>
+        <w:jc w:val="both"/>
+      </w:pPr>
+      <w:r>
+        <w:rPr>
+          <w:b/>
+        </w:rPr>
+        <w:t>DOA и сертификат типа</w:t>
+      </w:r>
+      <w:r>
+        <w:t xml:space="preserve"> — за PrincipalCo как разработчиком и OEM конфигурации F/A-259U; базовая платформа сертифицирована Aero Vodochody, а группа оформляет производный сертификат типа (или изменения к типу) и собственное одобрение разработчика.</w:t>
+      </w:r>
+    </w:p>
+    <w:p>
+      <w:pPr>
+        <w:pStyle w:val="ListBullet"/>
+        <w:spacing w:after="80"/>
+        <w:jc w:val="both"/>
+      </w:pPr>
+      <w:r>
+        <w:rPr>
+          <w:b/>
+        </w:rPr>
+        <w:t>POA</w:t>
+      </w:r>
+      <w:r>
+        <w:t xml:space="preserve"> — на первом этапе у контрактного сборщика Aero Vodochody, на чей POA опирается группа; на втором этапе собственный POA получает PrincipalCo (раздел 3.2).</w:t>
+      </w:r>
+    </w:p>
+    <w:p>
+      <w:pPr>
+        <w:jc w:val="both"/>
+      </w:pPr>
+      <w:r>
+        <w:rPr>
+          <w:b/>
+        </w:rPr>
+        <w:t>Связь с выбором модели.</w:t>
+      </w:r>
+      <w:r>
+        <w:t xml:space="preserve"> Выбор между Моделью 1 и Моделью 2 касается только того, где лежит коммерческая интеллектуальная собственность и возникает ли поток роялти; сертификационные статусы он не перемещает — они в любом случае остаются у PrincipalCo. Это дополнительный довод в пользу Модели 1: права на разработку и сертификационно-производственные функции сосредоточены в одной компании, что согласуется с подходом ОЭСР (DEMPE). В Модели 2 юридическое владение ИС уходит в холдинг, тогда как разработка, тип и производство (DOA, TC, POA) остаются у PrincipalCo — возникает разрыв между формальным владельцем прав и местом, где стоимость реально создаётся и контролируется, что усиливает риск оспаривания роялти.</w:t>
       </w:r>
     </w:p>
     <w:sectPr>

</xml_diff>